<commit_message>
Arquivo .pdf do trabalho adicionado
</commit_message>
<xml_diff>
--- a/primeiro-trabalho-pt/Sistema de Recuperacao de Documentos Perdidos.docx
+++ b/primeiro-trabalho-pt/Sistema de Recuperacao de Documentos Perdidos.docx
@@ -2362,10 +2362,7 @@
         <w:jc w:val="both"/>
       </w:pPr>
       <w:r>
-        <w:t>Nota-se que</w:t>
-      </w:r>
-      <w:r>
-        <w:t xml:space="preserve"> recuperação de um documento perdido depende hoje, em grande medida, de canais informais e não integrados</w:t>
+        <w:t>Nota-se que recuperação de um documento perdido depende hoje, em grande medida, de canais informais e não integrados</w:t>
       </w:r>
       <w:r>
         <w:t xml:space="preserve"> (normalmente se vê documentos pendurados em janelas de taxis e até mesmo em lojas)</w:t>

</xml_diff>

<commit_message>
Revisão Final do Trabalho e Adição dos Slides
</commit_message>
<xml_diff>
--- a/primeiro-trabalho-pt/Sistema de Recuperacao de Documentos Perdidos.docx
+++ b/primeiro-trabalho-pt/Sistema de Recuperacao de Documentos Perdidos.docx
@@ -1578,7 +1578,7 @@
                 <w:noProof/>
                 <w:webHidden/>
               </w:rPr>
-              <w:t>10</w:t>
+              <w:t>9</w:t>
             </w:r>
             <w:r>
               <w:rPr>
@@ -2016,7 +2016,7 @@
                 <w:noProof/>
                 <w:webHidden/>
               </w:rPr>
-              <w:t>12</w:t>
+              <w:t>11</w:t>
             </w:r>
             <w:r>
               <w:rPr>
@@ -2474,7 +2474,13 @@
         <w:t xml:space="preserve"> Muitos registos </w:t>
       </w:r>
       <w:r>
-        <w:t>tem suas</w:t>
+        <w:t>t</w:t>
+      </w:r>
+      <w:r>
+        <w:t>ê</w:t>
+      </w:r>
+      <w:r>
+        <w:t>m</w:t>
       </w:r>
       <w:r>
         <w:t xml:space="preserve"> descrições informais (</w:t>
@@ -2505,13 +2511,13 @@
         <w:t>burla</w:t>
       </w:r>
       <w:r>
-        <w:t xml:space="preserve"> e o uso indevido. </w:t>
-      </w:r>
-      <w:r>
-        <w:t>E com esse caso encontra-se duplicidade do</w:t>
-      </w:r>
-      <w:r>
-        <w:t xml:space="preserve"> problema: construir um mecanismo de cadastro e busca capaz de reunir documentos achados e documentos procurados com alto </w:t>
+        <w:t xml:space="preserve"> e o uso indevido.</w:t>
+      </w:r>
+      <w:r>
+        <w:t xml:space="preserve"> O problema, então, é duplo</w:t>
+      </w:r>
+      <w:r>
+        <w:t xml:space="preserve">: construir um mecanismo de cadastro e busca capaz de reunir documentos achados e documentos procurados com alto </w:t>
       </w:r>
       <w:r>
         <w:rPr>
@@ -2770,27 +2776,10 @@
         <w:t>R1.</w:t>
       </w:r>
       <w:r>
-        <w:t xml:space="preserve"> A busca semântica por </w:t>
-      </w:r>
-      <w:r>
-        <w:rPr>
-          <w:i/>
-          <w:iCs/>
-        </w:rPr>
-        <w:t>embeddings</w:t>
-      </w:r>
-      <w:r>
-        <w:t xml:space="preserve"> obtém </w:t>
-      </w:r>
-      <w:r>
-        <w:rPr>
-          <w:i/>
-          <w:iCs/>
-        </w:rPr>
-        <w:t>recall</w:t>
-      </w:r>
-      <w:r>
-        <w:t xml:space="preserve"> superior ao da busca por palavras-chave quando a consulta é incompleta ou descrita em texto livre.</w:t>
+        <w:t xml:space="preserve"> O Tesseract, apoiado por pré-processamento de imagem com OpenCV, oferece o melhor equilíbrio entre exatidão, custo e viabilidade de implantação, com o PaddleOCR como motor de reserva para imagens difíceis.</w:t>
+      </w:r>
+      <w:r>
+        <w:t>.</w:t>
       </w:r>
     </w:p>
     <w:p>
@@ -2814,10 +2803,7 @@
         <w:t xml:space="preserve"> </w:t>
       </w:r>
       <w:r>
-        <w:t xml:space="preserve">Um conjunto de tecnologias </w:t>
-      </w:r>
-      <w:r>
-        <w:t>especializado nas áreas de desenvolvimento como manipulação e analise de dados, consistencia e escalabilidade no armazenamento e busca por indexação</w:t>
+        <w:t>O conjunto formado por Python (FastAPI), React e PostgreSQL com pg_trgm e pgvector, porque reúne OCR, busca lexical, aproximada e vetorial num só serviço, em código aberto e de baixo custo.</w:t>
       </w:r>
     </w:p>
     <w:p>
@@ -2838,23 +2824,11 @@
         <w:t>R3.</w:t>
       </w:r>
       <w:r>
-        <w:t xml:space="preserve"> A busca híbrida, que funde as duas listas de resultados, obtém o melhor equilíbrio entre precisão e </w:t>
-      </w:r>
-      <w:r>
-        <w:rPr>
-          <w:i/>
-          <w:iCs/>
-        </w:rPr>
-        <w:t>recall</w:t>
-      </w:r>
-      <w:r>
-        <w:t xml:space="preserve"> (Cormack et al., 2009).</w:t>
-      </w:r>
-    </w:p>
-    <w:p>
-      <w:pPr>
-        <w:pStyle w:val="Forte1"/>
-      </w:pPr>
+        <w:t xml:space="preserve"> </w:t>
+      </w:r>
+      <w:r>
+        <w:t>Minimizando os dados mostrados (só o início e o fim do número e o nome parcialmente ocultado), cifrando os dados e verificando o dono antes de entregar o contacto.</w:t>
+      </w:r>
     </w:p>
     <w:p>
       <w:pPr>
@@ -2901,7 +2875,13 @@
         <w:t>-se uma prática essencial</w:t>
       </w:r>
       <w:r>
-        <w:t xml:space="preserve"> e “indespensavel”</w:t>
+        <w:t xml:space="preserve"> e “ind</w:t>
+      </w:r>
+      <w:r>
+        <w:t>i</w:t>
+      </w:r>
+      <w:r>
+        <w:t>spensavel”</w:t>
       </w:r>
       <w:r>
         <w:t>, especialmente após o aumento d</w:t>
@@ -3057,7 +3037,13 @@
         <w:t>para o desenvolvimento do</w:t>
       </w:r>
       <w:r>
-        <w:t xml:space="preserve"> sistema: motor de OCR, abordagem de recuperação de informação, motor de indexação e busca, linguagem de programação do servidor e sistema de gestão de base de dados. Em cada comparação iremos terminarcom a escolha e a justificativa. A comparação baseia-se na no conhecimento prévio sobre cada tecnologia,</w:t>
+        <w:t xml:space="preserve"> sistema: motor de OCR, abordagem de recuperação de informação, motor de indexação e busca, linguagem de programação do servidor e sistema de gestão de base de dados. Em cada comparação iremos terminar</w:t>
+      </w:r>
+      <w:r>
+        <w:t xml:space="preserve"> </w:t>
+      </w:r>
+      <w:r>
+        <w:t>com a escolha e a justificativa. A comparação baseia-se no conhecimento prévio sobre cada tecnologia,</w:t>
       </w:r>
       <w:r>
         <w:t xml:space="preserve"> tempo de aprendizado (no caso de não saber nada),</w:t>
@@ -4413,7 +4399,25 @@
           <w:szCs w:val="22"/>
         </w:rPr>
         <w:lastRenderedPageBreak/>
-        <w:t>Tabela 3. Alternativas de indexação e busca</w:t>
+        <w:t xml:space="preserve">Tabela </w:t>
+      </w:r>
+      <w:r>
+        <w:rPr>
+          <w:b/>
+          <w:bCs/>
+          <w:sz w:val="22"/>
+          <w:szCs w:val="22"/>
+        </w:rPr>
+        <w:t>2</w:t>
+      </w:r>
+      <w:r>
+        <w:rPr>
+          <w:b/>
+          <w:bCs/>
+          <w:sz w:val="22"/>
+          <w:szCs w:val="22"/>
+        </w:rPr>
+        <w:t>. Alternativas de indexação e busca</w:t>
       </w:r>
     </w:p>
     <w:tbl>
@@ -5292,7 +5296,25 @@
           <w:sz w:val="22"/>
           <w:szCs w:val="22"/>
         </w:rPr>
-        <w:t>Tabela 4. Python versus JavaScript (Node.js) no servidor</w:t>
+        <w:t xml:space="preserve">Tabela </w:t>
+      </w:r>
+      <w:r>
+        <w:rPr>
+          <w:b/>
+          <w:bCs/>
+          <w:sz w:val="22"/>
+          <w:szCs w:val="22"/>
+        </w:rPr>
+        <w:t>3</w:t>
+      </w:r>
+      <w:r>
+        <w:rPr>
+          <w:b/>
+          <w:bCs/>
+          <w:sz w:val="22"/>
+          <w:szCs w:val="22"/>
+        </w:rPr>
+        <w:t>. Python versus JavaScript (Node.js) no servidor</w:t>
       </w:r>
     </w:p>
     <w:tbl>
@@ -6126,7 +6148,25 @@
           <w:sz w:val="22"/>
           <w:szCs w:val="22"/>
         </w:rPr>
-        <w:t>Tabela 5. PostgreSQL versus MySQL</w:t>
+        <w:t xml:space="preserve">Tabela </w:t>
+      </w:r>
+      <w:r>
+        <w:rPr>
+          <w:b/>
+          <w:bCs/>
+          <w:sz w:val="22"/>
+          <w:szCs w:val="22"/>
+        </w:rPr>
+        <w:t>4</w:t>
+      </w:r>
+      <w:r>
+        <w:rPr>
+          <w:b/>
+          <w:bCs/>
+          <w:sz w:val="22"/>
+          <w:szCs w:val="22"/>
+        </w:rPr>
+        <w:t>. PostgreSQL versus MySQL</w:t>
       </w:r>
     </w:p>
     <w:tbl>
@@ -6845,7 +6885,19 @@
         <w:t>Escolha.</w:t>
       </w:r>
       <w:r>
-        <w:t xml:space="preserve"> Apesar de mais dominio e tempo de uso em MySQL, o PostgreSQL é a base de dados do sistema, por reunir num só serviço os requisitos de busca lexical, aproximada e vetorial.</w:t>
+        <w:t xml:space="preserve"> Apesar d</w:t>
+      </w:r>
+      <w:r>
+        <w:t>o</w:t>
+      </w:r>
+      <w:r>
+        <w:t xml:space="preserve"> </w:t>
+      </w:r>
+      <w:r>
+        <w:t>maior</w:t>
+      </w:r>
+      <w:r>
+        <w:t xml:space="preserve"> dominio e tempo de uso em MySQL, o PostgreSQL é a base de dados do sistema, por reunir num só serviço os requisitos de busca lexical, aproximada e vetorial.</w:t>
       </w:r>
     </w:p>
     <w:p>
@@ -6963,7 +7015,25 @@
           <w:sz w:val="22"/>
           <w:szCs w:val="22"/>
         </w:rPr>
-        <w:t>Tabela 6. Decisões das tecnologias</w:t>
+        <w:t xml:space="preserve">Tabela </w:t>
+      </w:r>
+      <w:r>
+        <w:rPr>
+          <w:b/>
+          <w:bCs/>
+          <w:sz w:val="22"/>
+          <w:szCs w:val="22"/>
+        </w:rPr>
+        <w:t>5</w:t>
+      </w:r>
+      <w:r>
+        <w:rPr>
+          <w:b/>
+          <w:bCs/>
+          <w:sz w:val="22"/>
+          <w:szCs w:val="22"/>
+        </w:rPr>
+        <w:t>. Decisões das tecnologias</w:t>
       </w:r>
     </w:p>
     <w:tbl>
@@ -7812,7 +7882,7 @@
         <w:jc w:val="both"/>
       </w:pPr>
       <w:r>
-        <w:t>Este capítulo descreve a arquitetura do sistema e cada uma das tecnologias selecionadas, o papel que desempenham e as razões para a sua utilização. Para cada uma, indicam-se também os principais riscos e as medidas de mitigação.</w:t>
+        <w:t>Este capítulo descreve a arquitetura do sistema e cada uma das tecnologias selecionadas, o papel que desempenham e as razões para a sua utilização.</w:t>
       </w:r>
     </w:p>
     <w:p>
@@ -7854,7 +7924,25 @@
           <w:sz w:val="22"/>
           <w:szCs w:val="22"/>
         </w:rPr>
-        <w:t>Tabela 7. Camadas da arquitetura</w:t>
+        <w:t xml:space="preserve">Tabela </w:t>
+      </w:r>
+      <w:r>
+        <w:rPr>
+          <w:b/>
+          <w:bCs/>
+          <w:sz w:val="22"/>
+          <w:szCs w:val="22"/>
+        </w:rPr>
+        <w:t>6</w:t>
+      </w:r>
+      <w:r>
+        <w:rPr>
+          <w:b/>
+          <w:bCs/>
+          <w:sz w:val="22"/>
+          <w:szCs w:val="22"/>
+        </w:rPr>
+        <w:t>. Camadas da arquitetura</w:t>
       </w:r>
     </w:p>
     <w:tbl>
@@ -8565,7 +8653,6 @@
       </w:pPr>
       <w:bookmarkStart w:id="17" w:name="_Toc243338262"/>
       <w:r>
-        <w:lastRenderedPageBreak/>
         <w:t xml:space="preserve">8.2 Frontend: HTML5, CSS3, JavaScript </w:t>
       </w:r>
       <w:r>
@@ -8630,7 +8717,11 @@
         <w:t>MediaDevices</w:t>
       </w:r>
       <w:r>
-        <w:t xml:space="preserve"> do navegador ou o elemento </w:t>
+        <w:t xml:space="preserve"> do </w:t>
+      </w:r>
+      <w:r>
+        <w:lastRenderedPageBreak/>
+        <w:t xml:space="preserve">navegador ou o elemento </w:t>
       </w:r>
       <w:r>
         <w:rPr>
@@ -8994,7 +9085,6 @@
         <w:jc w:val="both"/>
       </w:pPr>
       <w:r>
-        <w:lastRenderedPageBreak/>
         <w:t>Para documentos com campos em posições conhecidas, como o BI, aplicam-se regiões de interesse (</w:t>
       </w:r>
       <w:r>
@@ -9005,7 +9095,11 @@
         <w:t>templates</w:t>
       </w:r>
       <w:r>
-        <w:t>) que isolam cada campo e o leem com um modo de segmentação de linha única. Isto reduz erros de segmentação. Em campos como números de documento, restringe-se o conjunto de caracteres aceites (</w:t>
+        <w:t xml:space="preserve">) que isolam cada campo e o leem com um modo de segmentação de linha única. Isto reduz erros de segmentação. Em campos como números de documento, restringe-se </w:t>
+      </w:r>
+      <w:r>
+        <w:lastRenderedPageBreak/>
+        <w:t>o conjunto de caracteres aceites (</w:t>
       </w:r>
       <w:r>
         <w:rPr>
@@ -9313,7 +9407,6 @@
       </w:pPr>
       <w:bookmarkStart w:id="23" w:name="_Toc243338268"/>
       <w:r>
-        <w:lastRenderedPageBreak/>
         <w:t>8.</w:t>
       </w:r>
       <w:r>
@@ -9351,7 +9444,11 @@
         <w:t>Docker Compose</w:t>
       </w:r>
       <w:r>
-        <w:t xml:space="preserve"> descreve e arranca o conjunto com um único comando, o que torna o ambiente de desenvolvimento igual ao de produção e facilita a instalação em servidores de instituições. O </w:t>
+        <w:t xml:space="preserve"> descreve e arranca o conjunto com um único comando, o que torna o ambiente de desenvolvimento igual ao de produção e facilita a instalação em servidores de </w:t>
+      </w:r>
+      <w:r>
+        <w:lastRenderedPageBreak/>
+        <w:t xml:space="preserve">instituições. O </w:t>
       </w:r>
       <w:r>
         <w:rPr>
@@ -9503,51 +9600,12 @@
     </w:p>
     <w:p>
       <w:pPr>
-        <w:spacing w:after="80" w:line="276" w:lineRule="auto"/>
         <w:ind w:firstLine="567"/>
         <w:jc w:val="both"/>
       </w:pPr>
       <w:r>
-        <w:t>Teoricamente</w:t>
-      </w:r>
-      <w:r>
-        <w:t xml:space="preserve"> trabalho cumpre o objetivo geral ao fundamentar o desenho técnico do sistem</w:t>
-      </w:r>
-      <w:r>
-        <w:t>a</w:t>
-      </w:r>
-      <w:r>
-        <w:t>. A proteção de dados pessoais</w:t>
-      </w:r>
-      <w:r>
-        <w:t xml:space="preserve"> </w:t>
-      </w:r>
-      <w:r>
-        <w:t xml:space="preserve">é um requisito </w:t>
-      </w:r>
-      <w:r>
-        <w:t>obrigatorio</w:t>
-      </w:r>
-      <w:r>
-        <w:t xml:space="preserve">. </w:t>
-      </w:r>
-      <w:r>
-        <w:t xml:space="preserve">É previsto </w:t>
-      </w:r>
-      <w:r>
-        <w:t>a implementação de um protótipo funcional</w:t>
-      </w:r>
-      <w:r>
-        <w:t xml:space="preserve">, </w:t>
-      </w:r>
-      <w:r>
-        <w:t>o estudo de técnicas híbridas mais avançadas e um projeto-pilot</w:t>
-      </w:r>
-      <w:r>
-        <w:t>o.</w:t>
-      </w:r>
-    </w:p>
-    <w:p>
+        <w:t>Teoricamente, o trabalho cumpre o objetivo geral ao fundamentar o desenho técnico do sistema. As hipóteses e as respostas baseiam-se na literatura e ainda não foram validadas com testes. As principais limitações são a dependência da qualidade da imagem e a ausência de dados reais. A proteção de dados pessoais é um requisito obrigatório. Prevê-se, como próximos passos, a implementação de um protótipo funcional, o estudo de técnicas híbridas mais avançadas e um projeto-piloto</w:t>
+      </w:r>
       <w:r>
         <w:br w:type="page"/>
       </w:r>
@@ -9573,139 +9631,78 @@
     <w:p>
       <w:pPr>
         <w:spacing w:after="60" w:line="252" w:lineRule="auto"/>
-        <w:ind w:left="720" w:hanging="720"/>
-      </w:pPr>
-      <w:r>
-        <w:t xml:space="preserve">Baeza-Yates, R., &amp; Ribeiro-Neto, B. (2011). </w:t>
+      </w:pPr>
+      <w:r>
+        <w:t xml:space="preserve">Bradski, G. (2000). The OpenCV library. </w:t>
       </w:r>
       <w:r>
         <w:rPr>
           <w:i/>
           <w:iCs/>
         </w:rPr>
-        <w:t>Recuperção Moderna da Informação</w:t>
+        <w:t>Dr. Dobb’s Journal of Software Tools</w:t>
+      </w:r>
+      <w:r>
+        <w:t xml:space="preserve">, </w:t>
       </w:r>
       <w:r>
         <w:rPr>
           <w:i/>
           <w:iCs/>
         </w:rPr>
-        <w:t xml:space="preserve">: </w:t>
+        <w:t>25</w:t>
+      </w:r>
+      <w:r>
+        <w:t>(11), 120–125.</w:t>
+      </w:r>
+    </w:p>
+    <w:p>
+      <w:pPr>
+        <w:spacing w:after="60" w:line="252" w:lineRule="auto"/>
+      </w:pPr>
+      <w:r>
+        <w:t xml:space="preserve">Cormack, G. V., Clarke, C. L. A., &amp; Büttcher, S. (2009). Reciprocal rank fusion outperforms Condorcet and individual rank learning methods. In </w:t>
       </w:r>
       <w:r>
         <w:rPr>
           <w:i/>
           <w:iCs/>
         </w:rPr>
-        <w:t>O conceinto e a Tecnologia atrás da pesquisa</w:t>
-      </w:r>
-      <w:r>
-        <w:t>.</w:t>
+        <w:t>Proceedings of the 32nd International ACM SIGIR Conference on Research and Development in Information Retrieval</w:t>
+      </w:r>
+      <w:r>
+        <w:t xml:space="preserve"> (pp. 758–759). ACM.</w:t>
       </w:r>
     </w:p>
     <w:p>
       <w:pPr>
         <w:spacing w:after="60" w:line="252" w:lineRule="auto"/>
-        <w:ind w:left="720" w:hanging="720"/>
-      </w:pPr>
-      <w:r>
-        <w:t xml:space="preserve">Bradski, G. (2000). The OpenCV library. </w:t>
+      </w:pPr>
+      <w:r>
+        <w:t xml:space="preserve">Du, Y., Li, C., Guo, R., Yin, X., Liu, W., Zhou, J., Bai, Y., Yu, Z., Yang, Y., Dang, Q., &amp; Wang, H. (2020). </w:t>
       </w:r>
       <w:r>
         <w:rPr>
           <w:i/>
           <w:iCs/>
         </w:rPr>
-        <w:t xml:space="preserve">Dr. Dobb’s </w:t>
-      </w:r>
-      <w:r>
-        <w:rPr>
-          <w:i/>
-          <w:iCs/>
-        </w:rPr>
-        <w:t>Jornal das ferramentas de Software</w:t>
-      </w:r>
-      <w:r>
-        <w:t>.</w:t>
-      </w:r>
-    </w:p>
-    <w:p>
-      <w:pPr>
-        <w:spacing w:after="60" w:line="252" w:lineRule="auto"/>
-        <w:ind w:left="720" w:hanging="720"/>
-      </w:pPr>
-      <w:r>
-        <w:t xml:space="preserve">Fielding, R. T. (2000). </w:t>
-      </w:r>
-      <w:r>
-        <w:rPr>
-          <w:i/>
-          <w:iCs/>
-        </w:rPr>
-        <w:t>Estilo de Arquitetura e o Design da rede baseado em Estilo de</w:t>
-      </w:r>
-      <w:r>
-        <w:rPr>
-          <w:i/>
-          <w:iCs/>
-        </w:rPr>
-        <w:t xml:space="preserve"> </w:t>
-      </w:r>
-      <w:r>
-        <w:rPr>
-          <w:i/>
-          <w:iCs/>
-        </w:rPr>
-        <w:t>Arquitetura</w:t>
-      </w:r>
-      <w:r>
-        <w:t>.</w:t>
-      </w:r>
-    </w:p>
-    <w:p>
-      <w:pPr>
-        <w:spacing w:after="60" w:line="252" w:lineRule="auto"/>
-        <w:ind w:left="720" w:hanging="720"/>
-      </w:pPr>
-      <w:r>
-        <w:t xml:space="preserve">Google. (s.d.). </w:t>
-      </w:r>
-      <w:r>
-        <w:rPr>
-          <w:i/>
-          <w:iCs/>
-        </w:rPr>
-        <w:t>Documentação da API do C</w:t>
-      </w:r>
-      <w:r>
-        <w:rPr>
-          <w:i/>
-          <w:iCs/>
-        </w:rPr>
-        <w:t>loud Vision</w:t>
-      </w:r>
-      <w:r>
-        <w:t xml:space="preserve">. </w:t>
-      </w:r>
-    </w:p>
-    <w:p>
-      <w:pPr>
-        <w:spacing w:after="60" w:line="252" w:lineRule="auto"/>
-        <w:ind w:left="720"/>
-      </w:pPr>
+        <w:t>PP-OCR: A practical ultra lightweight OCR system</w:t>
+      </w:r>
+      <w:r>
+        <w:t xml:space="preserve"> [Preprint]. arXiv. </w:t>
+      </w:r>
       <w:hyperlink r:id="rId9" w:history="1">
         <w:r>
           <w:rPr>
             <w:rStyle w:val="Hyperlink"/>
           </w:rPr>
-          <w:t>https://cloud.google.com/vision/docs</w:t>
+          <w:t>https://arxiv.org/abs/2009.09941</w:t>
         </w:r>
       </w:hyperlink>
     </w:p>
     <w:p>
       <w:pPr>
         <w:spacing w:after="60" w:line="252" w:lineRule="auto"/>
-        <w:ind w:left="720" w:hanging="720"/>
       </w:pPr>
       <w:r>
         <w:t xml:space="preserve">Gormley, C., &amp; Tong, Z. (2015). </w:t>
@@ -9715,39 +9712,28 @@
           <w:i/>
           <w:iCs/>
         </w:rPr>
-        <w:t xml:space="preserve">Elasticsearch: </w:t>
+        <w:t>Elasticsearch: The definitive guide</w:t>
+      </w:r>
+      <w:r>
+        <w:t>. O’Reilly Media.</w:t>
+      </w:r>
+    </w:p>
+    <w:p>
+      <w:pPr>
+        <w:spacing w:after="60" w:line="252" w:lineRule="auto"/>
+      </w:pPr>
+      <w:r>
+        <w:t xml:space="preserve">Kane, A. (s.d.). </w:t>
       </w:r>
       <w:r>
         <w:rPr>
           <w:i/>
           <w:iCs/>
         </w:rPr>
-        <w:t>O guia definitivo</w:t>
-      </w:r>
-      <w:r>
-        <w:t>.</w:t>
-      </w:r>
-    </w:p>
-    <w:p>
-      <w:pPr>
-        <w:spacing w:after="60" w:line="252" w:lineRule="auto"/>
-        <w:ind w:left="720" w:hanging="720"/>
-      </w:pPr>
-      <w:r>
-        <w:t xml:space="preserve">Kane, A. (s.d.). </w:t>
-      </w:r>
-      <w:r>
-        <w:rPr>
-          <w:i/>
-          <w:iCs/>
-        </w:rPr>
         <w:t>pgvector: Open-source vector similarity search for Postgres</w:t>
       </w:r>
       <w:r>
-        <w:t xml:space="preserve"> [Software].</w:t>
-      </w:r>
-      <w:r>
-        <w:t xml:space="preserve"> </w:t>
+        <w:t xml:space="preserve"> [Software]. GitHub. </w:t>
       </w:r>
       <w:hyperlink r:id="rId10" w:history="1">
         <w:r>
@@ -9763,30 +9749,129 @@
         <w:spacing w:after="60" w:line="252" w:lineRule="auto"/>
       </w:pPr>
       <w:r>
-        <w:t>Merkel, D. (2014). Docker: Lightweight Linux containers for consistent development and deployment.</w:t>
-      </w:r>
-    </w:p>
-    <w:p>
-      <w:pPr>
-        <w:spacing w:after="60" w:line="252" w:lineRule="auto"/>
-        <w:ind w:left="720" w:hanging="720"/>
-      </w:pPr>
-      <w:r>
-        <w:t xml:space="preserve">PostgreSQL Global Development Group. (2024). </w:t>
+        <w:t xml:space="preserve">Levenshtein, V. I. (1966). Binary codes capable of correcting deletions, insertions, and reversals. </w:t>
       </w:r>
       <w:r>
         <w:rPr>
           <w:i/>
           <w:iCs/>
         </w:rPr>
-        <w:t>Documentação do</w:t>
+        <w:t>Soviet Physics Doklady</w:t>
+      </w:r>
+      <w:r>
+        <w:t xml:space="preserve">, </w:t>
       </w:r>
       <w:r>
         <w:rPr>
           <w:i/>
           <w:iCs/>
         </w:rPr>
-        <w:t xml:space="preserve"> PostgreSQL. </w:t>
+        <w:t>10</w:t>
+      </w:r>
+      <w:r>
+        <w:t>(8), 707–710.</w:t>
+      </w:r>
+    </w:p>
+    <w:p>
+      <w:pPr>
+        <w:spacing w:after="60" w:line="252" w:lineRule="auto"/>
+      </w:pPr>
+      <w:r>
+        <w:t xml:space="preserve">Li, M., Lv, T., Chen, J., Cui, L., Lu, Y., Florencio, D., Zhang, C., Li, Z., &amp; Wei, F. (2023). TrOCR: Transformer-based optical character recognition with pre-trained models. </w:t>
+      </w:r>
+      <w:r>
+        <w:rPr>
+          <w:i/>
+          <w:iCs/>
+        </w:rPr>
+        <w:t>Proceedings of the AAAI Conference on Artificial Intelligence</w:t>
+      </w:r>
+      <w:r>
+        <w:t xml:space="preserve">, </w:t>
+      </w:r>
+      <w:r>
+        <w:rPr>
+          <w:i/>
+          <w:iCs/>
+        </w:rPr>
+        <w:t>37</w:t>
+      </w:r>
+      <w:r>
+        <w:t>(11), 13094–13102.</w:t>
+      </w:r>
+    </w:p>
+    <w:p>
+      <w:pPr>
+        <w:spacing w:after="60" w:line="252" w:lineRule="auto"/>
+      </w:pPr>
+      <w:r>
+        <w:t xml:space="preserve">Malkov, Y. A., &amp; Yashunin, D. A. (2020). Efficient and robust approximate nearest neighbor search using hierarchical navigable small world graphs. </w:t>
+      </w:r>
+      <w:r>
+        <w:rPr>
+          <w:i/>
+          <w:iCs/>
+        </w:rPr>
+        <w:t>IEEE Transactions on Pattern Analysis and Machine Intelligence</w:t>
+      </w:r>
+      <w:r>
+        <w:t xml:space="preserve">, </w:t>
+      </w:r>
+      <w:r>
+        <w:rPr>
+          <w:i/>
+          <w:iCs/>
+        </w:rPr>
+        <w:t>42</w:t>
+      </w:r>
+      <w:r>
+        <w:t>(4), 824–836.</w:t>
+      </w:r>
+    </w:p>
+    <w:p>
+      <w:pPr>
+        <w:spacing w:after="60" w:line="252" w:lineRule="auto"/>
+      </w:pPr>
+      <w:r>
+        <w:t xml:space="preserve">Merkel, D. (2014). Docker: Lightweight Linux containers for consistent development and deployment. </w:t>
+      </w:r>
+      <w:r>
+        <w:rPr>
+          <w:i/>
+          <w:iCs/>
+        </w:rPr>
+        <w:t>Linux Journal</w:t>
+      </w:r>
+      <w:r>
+        <w:t xml:space="preserve">, </w:t>
+      </w:r>
+      <w:r>
+        <w:rPr>
+          <w:i/>
+          <w:iCs/>
+        </w:rPr>
+        <w:t>2014</w:t>
+      </w:r>
+      <w:r>
+        <w:t>(239), Article 2.</w:t>
+      </w:r>
+    </w:p>
+    <w:p>
+      <w:pPr>
+        <w:spacing w:after="60" w:line="252" w:lineRule="auto"/>
+      </w:pPr>
+      <w:r>
+        <w:t xml:space="preserve">PostgreSQL Global Development Group. (2024). </w:t>
+      </w:r>
+      <w:r>
+        <w:rPr>
+          <w:i/>
+          <w:iCs/>
+        </w:rPr>
+        <w:t>PostgreSQL documentation</w:t>
+      </w:r>
+      <w:r>
+        <w:t xml:space="preserve">. </w:t>
       </w:r>
       <w:hyperlink r:id="rId11" w:history="1">
         <w:r>
@@ -9801,35 +9886,6 @@
       <w:pPr>
         <w:spacing w:after="60" w:line="252" w:lineRule="auto"/>
       </w:pPr>
-      <w:r>
-        <w:rPr>
-          <w:i/>
-          <w:iCs/>
-        </w:rPr>
-        <w:t>FastAPI</w:t>
-      </w:r>
-      <w:r>
-        <w:t xml:space="preserve"> [Documentação]. </w:t>
-      </w:r>
-    </w:p>
-    <w:p>
-      <w:pPr>
-        <w:spacing w:after="60" w:line="252" w:lineRule="auto"/>
-        <w:ind w:firstLine="720"/>
-      </w:pPr>
-      <w:hyperlink r:id="rId12" w:history="1">
-        <w:r>
-          <w:rPr>
-            <w:rStyle w:val="Hyperlink"/>
-          </w:rPr>
-          <w:t>https://fastapi.tiangolo.com</w:t>
-        </w:r>
-      </w:hyperlink>
-    </w:p>
-    <w:p>
-      <w:pPr>
-        <w:spacing w:after="60" w:line="252" w:lineRule="auto"/>
-      </w:pPr>
     </w:p>
     <w:p>
       <w:pPr>
@@ -9839,8 +9895,8 @@
       </w:pPr>
     </w:p>
     <w:sectPr>
-      <w:footerReference w:type="default" r:id="rId13"/>
-      <w:footerReference w:type="first" r:id="rId14"/>
+      <w:footerReference w:type="default" r:id="rId12"/>
+      <w:footerReference w:type="first" r:id="rId13"/>
       <w:pgSz w:w="11906" w:h="16838"/>
       <w:pgMar w:top="1417" w:right="1417" w:bottom="1417" w:left="1701" w:header="708" w:footer="708" w:gutter="0"/>
       <w:cols w:space="720"/>
@@ -10684,7 +10740,6 @@
   <w:style w:type="character" w:default="1" w:styleId="Fontepargpadro">
     <w:name w:val="Default Paragraph Font"/>
     <w:uiPriority w:val="1"/>
-    <w:semiHidden/>
     <w:unhideWhenUsed/>
   </w:style>
   <w:style w:type="table" w:default="1" w:styleId="Tabelanormal">

</xml_diff>